<commit_message>
Update PIR EIR guidance and parameter template
</commit_message>
<xml_diff>
--- a/docs/artigos/Artigo_Tecnico_Gates_Requisitos_Validacao_IFC_Orientado.docx
+++ b/docs/artigos/Artigo_Tecnico_Gates_Requisitos_Validacao_IFC_Orientado.docx
@@ -243,6 +243,74 @@
           <w:sz w:val="22"/>
         </w:rPr>
         <w:t>Essa decomposição é coerente com a lógica da ISO 19650 porque vincula a informação requerida à sua finalidade, ao momento em que deve estar disponível e a quem deve produzi-la. Ao mesmo tempo, prepara o requisito para os padrões openBIM. O IFC fornece o schema de classes, propriedades, quantidades e relações; o bSDD oferece infraestrutura para distribuir dicionários, classes, propriedades, relações e identificadores semânticos; e o IDS formaliza requisitos de informação em formato interpretável por computadores [3][4][5].</w:t>
+      </w:r>
+    </w:p>
+    <w:p>
+      <w:pPr>
+        <w:pStyle w:val="Heading2"/>
+      </w:pPr>
+      <w:r>
+        <w:t>2.1. Exemplo aplicado: largura livre de uma porta acessível</w:t>
+      </w:r>
+    </w:p>
+    <w:p>
+      <w:pPr/>
+      <w:r>
+        <w:t>Para demonstrar a passagem entre necessidade, especificação de entrega e verificação automática, considere a largura livre de uma porta pertencente a uma rota acessível. O exemplo evidencia que o processo começa pela decisão que deve ser apoiada, e não pelo nome de um parâmetro.</w:t>
+      </w:r>
+    </w:p>
+    <w:p>
+      <w:pPr/>
+      <w:r>
+        <w:rPr>
+          <w:b/>
+        </w:rPr>
+        <w:t>PIR — decisão a apoiar.</w:t>
+      </w:r>
+      <w:r>
+        <w:t xml:space="preserve"> A contratante precisa decidir, ao final do projeto executivo, se as rotas acessíveis possuem portas com largura livre adequada ao uso previsto. O PIR registra a decisão, a informação necessária, os objetos envolvidos e o ponto-chave de decisão. Nesse nível, ainda não é obrigatório definir o nome do parâmetro nem o Pset de destino.</w:t>
+      </w:r>
+    </w:p>
+    <w:p>
+      <w:pPr/>
+      <w:r>
+        <w:rPr>
+          <w:b/>
+        </w:rPr>
+        <w:t>EIR — condições de entrega.</w:t>
+      </w:r>
+      <w:r>
+        <w:t xml:space="preserve"> O EIR traduz essa necessidade em condições gerenciais, comerciais e técnicas. A Arquitetura é responsável pela informação; a entrega ocorre no marco do projeto executivo; cada porta aplicável deve informar a largura livre em milímetros; e o dado deve ser exportado ao IFC no destino aprovado. O conjunto de evidências pode incluir o modelo IFC, a especificação IDS e o relatório de validação.</w:t>
+      </w:r>
+    </w:p>
+    <w:p>
+      <w:pPr/>
+      <w:r>
+        <w:t>Como exemplo técnico, a matriz pode aprovar IfcDoor como entidade aplicável, Pset_Acessibilidade como conjunto, LarguraLivre como propriedade, IfcLengthMeasure como datatype, milímetro como unidade e cardinalidade obrigatória de uma ocorrência por porta aplicável. Esse destino é uma decisão do projeto e deve ser usado apenas quando nenhum atributo, Pset ou Qto oficial representar corretamente o conceito.</w:t>
+      </w:r>
+    </w:p>
+    <w:p>
+      <w:pPr/>
+      <w:r>
+        <w:rPr>
+          <w:b/>
+        </w:rPr>
+        <w:t>IDS — parcela verificável.</w:t>
+      </w:r>
+      <w:r>
+        <w:t xml:space="preserve"> O IDS formaliza a condição que pode ser testada automaticamente no IFC: toda IfcDoor identificada como pertencente à rota acessível deve possuir Pset_Acessibilidade.LarguraLivre, com valor numérico preenchido e igual ou superior ao limite aprovado.</w:t>
+      </w:r>
+    </w:p>
+    <w:p>
+      <w:pPr/>
+      <w:r>
+        <w:t>O IDS não comprova, sozinho, se a rota acessível foi corretamente definida, se o limite adotado atende à legislação, se a disciplina entregou no prazo ou se as condições comerciais foram cumpridas. Essas decisões permanecem no processo de gestão e aprovação.</w:t>
+      </w:r>
+    </w:p>
+    <w:p>
+      <w:pPr/>
+      <w:r>
+        <w:t>A cadeia pode ser resumida assim: PIR — “precisamos decidir se as rotas são acessíveis”; EIR — “as portas aplicáveis devem entregar a largura livre no IFC, com responsabilidade, prazo, estrutura e evidências definidos”; IDS — “verifique no IFC se cada porta aplicável possui a propriedade exigida e se o valor atende ao limite aprovado”. Portanto, o IDS não substitui o EIR: ele automatiza somente a parte técnica efetivamente representada e verificável no IFC.</w:t>
       </w:r>
     </w:p>
     <w:tbl>

</xml_diff>